<commit_message>
Align report with blueprint v2: 3,000-word budget, tables to appendices, Historic England listing
Co-Authored-By: Claude Sonnet 5.5 <noreply@anthropic.com>
Claude-Session: https://claude.ai/code/session_011X5bu1ABRj6tnHM3EMjxrh
</commit_message>
<xml_diff>
--- a/melia-report2/Melia-Promise-and-Proof-report.docx
+++ b/melia-report2/Melia-Promise-and-Proof-report.docx
@@ -140,7 +140,7 @@
         <w:pStyle w:val="FirstParagraph"/>
       </w:pPr>
       <w:r>
-        <w:t xml:space="preserve">Meliá White House is a Grade II listed 1930s building on Albany Street, London, operated by Meliá since 1999. Meliá reports a £40m, five-year renovation of its 581 bedrooms and suites, restaurant, bar and public spaces, carried out while the hotel kept trading (Hospitality Net, 2023). Business Traveller (2024) dates completion to April 2023. The hotel now sells itself as premium.</w:t>
+        <w:t xml:space="preserve">Meliá White House is a Grade II listed building on Albany Street, London, designed in 1936 and operated by Meliá since 1999 (Historic England, n.d.). Meliá reports a £40m, five-year renovation of its 581 bedrooms and suites, restaurant, bar and public spaces, carried out while the hotel kept trading (Hospitality Net, 2023). Business Traveller (2024) dates completion to April 2023. The hotel now sells itself as premium.</w:t>
       </w:r>
     </w:p>
     <w:p>
@@ -254,7 +254,7 @@
         <w:pStyle w:val="BodyText"/>
       </w:pPr>
       <w:r>
-        <w:t xml:space="preserve">Secondary data comprised Camden Council planning documents, Meliá press material, trade press, ranking coverage from Brand Finance and S&amp;P Global, and a coded sample of online reviews analysed thematically (Braun and Clarke, 2006). Following Denzin (1978) and Bryman and Bell (2015), each claim is checked against at least two source types, because no single source here is free of bias.</w:t>
+        <w:t xml:space="preserve">Secondary data comprised Camden Council planning documents, Meliá press material, trade press, ranking coverage from Brand Finance and S&amp;P Global, and a coded sample of online reviews analysed thematically (Braun and Clarke, 2006). Following Denzin (1978) and Bryman and Bell (2015), each claim is checked against at least two source types.</w:t>
       </w:r>
     </w:p>
     <w:p>
@@ -262,7 +262,7 @@
         <w:pStyle w:val="BodyText"/>
       </w:pPr>
       <w:r>
-        <w:t xml:space="preserve">The limits are specific. There was one visit and one managed tour, and management accounts were unavailable. Corporate sources are promotional, and online reviews are self-selected, so the review sample is indicative only (Litvin, Goldsmith and Pan, 2008). Sources also conflict: Meliá’s press material gives 581 bedrooms, while a Camden Council document gives 548 (Camden Council, 2025). Both are reported and neither is chosen silently. A final caution concerns dates. The co-working article is from April 2024, so prices may have changed, and the £300 figure is a verbal staff quote of a starting rate, not a published tariff. Findings are therefore indicative, and every claim is tied to its source. Appendix 2 maps each source.</w:t>
+        <w:t xml:space="preserve">The limits are specific. There was one visit and one managed tour, and management accounts were unavailable. Corporate sources are promotional, and online reviews are self-selected, so the review sample is indicative only (Litvin, Goldsmith and Pan, 2008; Sparks and Browning, 2011). Sources also conflict: Meliá’s press material gives 581 bedrooms, while a Camden Council document gives 548 (Camden Council, 2025). Both are reported and neither is chosen silently. The co-working article is from April 2024, so prices may have changed, and the £300 figure is a verbal staff quote of a starting rate, not a published tariff. Findings are therefore indicative. Appendix 2 maps each source.</w:t>
       </w:r>
     </w:p>
     <w:bookmarkEnd w:id="21"/>
@@ -316,7 +316,7 @@
         <w:t xml:space="preserve"> </w:t>
       </w:r>
       <w:r>
-        <w:t xml:space="preserve">Kano et al. (1984) hold that some features are expected and invisible when present, while others delight. Categories are normally set by survey and shift by guest type, so here they are inferred from photographs and say so. A clean lift and grille are must-be features, whereas Arado and Spanish cava are attractive ones. Adding delight on top of weak basics wastes money. The framework also warns that today’s delight becomes tomorrow’s expectation, so Arado’s success raises the bar for the rooms.</w:t>
+        <w:t xml:space="preserve">Kano et al. (1984) hold that some features are expected and invisible when present, while others delight. Categories are normally set by survey and shift by guest type, so here they are inferred from photographs and say so. A clean lift and grille are must-be features, whereas Arado and Spanish cava are attractive ones. Adding delight on top of weak basics wastes money.</w:t>
       </w:r>
     </w:p>
     <w:p>
@@ -334,7 +334,7 @@
         <w:t xml:space="preserve"> </w:t>
       </w:r>
       <w:r>
-        <w:t xml:space="preserve">Turley and Milliman (2000) treat atmosphere as a driver of behaviour, though their evidence comes largely from retail. Poria, Butler and Airey (2003) suggest heritage visitors value a personal link with the past, so worn fabric can read as character. The same patina can read as neglect once the guest has paid a premium rate. The lens tests cornices and oak against a dull lift door and a dusty grille. A fair reading must also allow that guests differ: those who chose the hotel for its heritage may forgive what others notice at once.</w:t>
+        <w:t xml:space="preserve">Turley and Milliman (2000) treat atmosphere as a driver of behaviour, though their evidence comes largely from retail. Poria, Butler and Airey (2003) suggest heritage visitors value a personal link with the past, so worn fabric can read as character. The same patina can read as neglect once the guest has paid a premium rate. The lens tests cornices and oak against a dull lift door and a dusty grille.</w:t>
       </w:r>
     </w:p>
     <w:p>
@@ -370,7 +370,7 @@
         <w:t xml:space="preserve"> </w:t>
       </w:r>
       <w:r>
-        <w:t xml:space="preserve">Kim and Mauborgne (2004) reward standing out by raising what guests value, whereas Treacy and Wiersema (1993) warn that a firm should excel at one value discipline. Blue-ocean claims also rest on selected success cases. The lens asks whether a premium, heritage and Spanish-food story is too ambitious to hold across every touchpoint. Both authors agree that a position needs coherence, which is the test applied below.</w:t>
+        <w:t xml:space="preserve">Kim and Mauborgne (2004) reward standing out by raising what guests value, whereas Treacy and Wiersema (1993) warn that a firm should excel at one value discipline. The lens asks whether a premium, heritage and Spanish-food story is too ambitious to hold across every touchpoint. Coherence is the test applied below.</w:t>
       </w:r>
     </w:p>
     <w:p>
@@ -396,7 +396,7 @@
         <w:pStyle w:val="BodyText"/>
       </w:pPr>
       <w:r>
-        <w:t xml:space="preserve">Together the lenses form a chain. Grönroos classifies what was seen, Kano ranks its importance, the setting and value lenses explain why it matters at this price, positioning asks whether the strategy can hold, and recovery asks how failure is handled.</w:t>
+        <w:t xml:space="preserve">Together: Grönroos classifies what was seen, Kano ranks it, setting and value explain why it matters at this price, positioning asks whether the strategy holds, and recovery asks how failure is handled.</w:t>
       </w:r>
     </w:p>
     <w:bookmarkEnd w:id="22"/>
@@ -424,7 +424,7 @@
         <w:t xml:space="preserve"> </w:t>
       </w:r>
       <w:r>
-        <w:t xml:space="preserve">Meliá reports £40m invested over five years while the hotel stayed open (Hospitality Net, 2023). Grant (1991) would treat a Grade II listed building as a scarce resource that rivals cannot copy. Eisenhardt and Martin (2000) frame renovating while trading as a capability, because revenue and learning continue. The corridors and gym show the heritage carried through: cornice detail runs through the fitness area (Fig. 6) and the lift lobby pairs black marble with a pedimented surround (Fig. 1). Yet Poria et al. (2003) question whether guests value heritage at all, and the same two photographs show how quickly it turns into a liability when not maintained. The lift door has a dull, uneven finish, and the air-conditioning grille above the cornice is visibly dusty. Camden filings also show works continuing in 2025, including a Wing A refurbishment and a basement conversion (Camden Council, 2025) [CHECK AGAINST THE RECORD]. The verdict is that the asset justified the bet, but trading through works moved some cost onto guests, and a £40m spend only protects value if standards are then sustained. The building is the hotel’s moat only while it looks cared for. The renovation creates an obligation to maintain, not merely to reach a standard once.</w:t>
+        <w:t xml:space="preserve">Meliá reports £40m invested over five years while the hotel stayed open (Hospitality Net, 2023). Grant (1991) would treat a Grade II listed building as a scarce resource that rivals cannot copy. Eisenhardt and Martin (2000) frame renovating while trading as a capability, because revenue and learning continue. The corridors and gym show the heritage carried through: cornice detail runs through the fitness area (Fig. 6) and the lift lobby pairs black marble with a pedimented surround (Fig. 1). Yet Poria et al. (2003) question whether guests value heritage at all, and the same two photographs show how quickly it turns into a liability when not maintained. The lift door has a dull, uneven finish, and the air-conditioning grille above the cornice is visibly dusty. Camden filings also show works continuing in 2025, including a Wing A refurbishment and a basement conversion (Camden Council, 2025) [CHECK AGAINST THE RECORD]. The verdict is that the asset justified the bet, but trading through works moved some cost onto guests, and a £40m spend only protects value if standards are then sustained. The renovation creates an obligation to maintain, not merely to reach a standard once.</w:t>
       </w:r>
     </w:p>
     <w:p>
@@ -442,7 +442,7 @@
         <w:t xml:space="preserve"> </w:t>
       </w:r>
       <w:r>
-        <w:t xml:space="preserve">Arado, the buffet, Spanish wines and organic cava give the hotel a distinct food and drink identity. Kim and Mauborgne (2004) would praise the distinctiveness, but Treacy and Wiersema (1993) would ask whether it is carried through everywhere. The buffet counter shows the concept working where guests can see it: lit shelving of GMED olive oils, hot-lamp pass, bread in linen bags and a bowl of Real Crisps (Fig. 2). The drinks station adds Spanish wines (Embrujo, La Prensa, Arnegui Rioja Crianza) and, on ice, Codorníu Cuvée Original Brut Ecológico beside Flama d’Or cava (Fig. 3). Buffet operations depend on consistent replenishment and presentation (Davis et al., 2018) [CHECK PAGE], which the stocked, orderly counter suggests was achieved on the day. The concept breaks in the room. The tea and coffee tray holds Nescafé Original sachets and portion milk, on a black marble top with visible water marks and smears (Fig. 5), which contradicts the Spanish, premium identity. The verdict is a good bet undermined by a fixable inconsistency. Gentile, Spiller and Noci (2007) explain why it matters: experience is built from many components, so a weak one dilutes the rest. A guest who enjoyed Spanish oils and cava at breakfast will judge the room’s coffee against that standard, not against a generic hotel. The fix is modest, since a Spanish coffee or tea offer extends an existing supplier relationship instead of creating a new concept.</w:t>
+        <w:t xml:space="preserve">Arado, the buffet, Spanish wines and organic cava give the hotel a distinct food and drink identity. Kim and Mauborgne (2004) would praise the distinctiveness, but Treacy and Wiersema (1993) would ask whether it is carried through everywhere. The buffet counter shows the concept working where guests can see it: lit shelving of GMED olive oils, hot-lamp pass, bread in linen bags and a bowl of Real Crisps (Fig. 2). The drinks station adds Spanish wines (Embrujo, La Prensa, Arnegui Rioja Crianza) and, on ice, Codorníu Cuvée Original Brut Ecológico beside Flama d’Or cava (Fig. 3). The concept breaks in the room. The tea and coffee tray holds Nescafé Original sachets and portion milk, on a black marble top with visible water marks and smears (Fig. 5), which contradicts the Spanish, premium identity. The verdict is a good bet undermined by a fixable inconsistency. Gentile, Spiller and Noci (2007) explain why it matters: experience is built from many components, so a weak one dilutes the rest. A guest who enjoyed Spanish oils and cava at breakfast will judge the room’s coffee against that standard, not against a generic hotel. The fix is modest, since a Spanish coffee or tea offer extends an existing supplier relationship instead of creating a new concept.</w:t>
       </w:r>
     </w:p>
     <w:p>
@@ -460,7 +460,7 @@
         <w:t xml:space="preserve"> </w:t>
       </w:r>
       <w:r>
-        <w:t xml:space="preserve">Business Traveller (2024) reports ten workspaces from £40 a day, with 10% off at Arado and ’35 Bar and complimentary tea, coffee and snacks. The Level lounge has its own entrance on Longford Street and was previously open only to guests in selected suites. Ansoff (1957) would call this related diversification: a new offer sold into familiar markets and assets. Drucker (1985) sees innovation in under-used resources, and a quiet lounge fits that description. Olsen, West and Tse (2008) add that diversification should reinforce the core. The photographs show a long timber table with power-ready seating beside softer café-style tables facing a garden (Fig. 4) and a dark-wood, red-velvet ’35 Bar (Fig. 8), so the offer exists as a flexible work-and-dine space with a distinct second outlet. The verdict is that this is a sensible use of space and a plausible cross-selling lever, but usage and revenue are unknown and the trade press source may carry partner input. The evidence supports intent, not performance, which is why Recommendation 4 tracks it. Ten desks are also a small share of a hotel with several hundred rooms, so the scheme is better read as a way of drawing local professionals into Arado and ’35 Bar than as a major revenue line. Without redemption data the discount cannot be judged either a sound lever or a giveaway to people who would have bought anyway.</w:t>
+        <w:t xml:space="preserve">Business Traveller (2024) reports ten workspaces from £40 a day, with 10% off at Arado and ’35 Bar and complimentary tea, coffee and snacks. The Level lounge has its own entrance on Longford Street and was previously open only to guests in selected suites. Ansoff (1957) would call this related diversification: a new offer sold into familiar markets and assets. Drucker (1985) sees innovation in under-used resources, and a quiet lounge fits that description. Olsen, West and Tse (2008) add that diversification should reinforce the core. The photographs show a long timber table with power-ready seating beside softer café-style tables facing a garden (Fig. 4) and a dark-wood, red-velvet ’35 Bar (Fig. 8), so the offer exists as a flexible work-and-dine space with a distinct second outlet. The verdict is that this is a sensible use of space and a plausible cross-selling lever, but usage and revenue are unknown and the trade press source may carry partner input. The evidence supports intent, not performance, which is why Recommendation 4 tracks it. Ten desks are a small share of a hotel with several hundred rooms, so the scheme is better read as a way of drawing local professionals into Arado and ’35 Bar than as a major revenue line, and without redemption data the discount cannot be judged.</w:t>
       </w:r>
     </w:p>
     <w:p>
@@ -496,7 +496,7 @@
         <w:pStyle w:val="FirstParagraph"/>
       </w:pPr>
       <w:r>
-        <w:t xml:space="preserve">The evidence types agree on the pattern. The photographs, the documents and the reviews point to strength in public spaces, breakfast and the bar, and weakness in condition and consistency. Observation shows the intended design, reviews show lived experience, and the documents show what the hotel says it has done. Where they disagree, repeated guest accounts outweigh a single promotional claim. They disagree on scale: the photographs show small, visible faults, whereas the press material promises that the hotel exceeds expectations. Triangulation here is a credibility check, not statistical proof.</w:t>
+        <w:t xml:space="preserve">The evidence types agree on the pattern. The photographs, the documents and the reviews point to strength in public spaces, breakfast and the bar, and weakness in condition and consistency. Where they disagree, repeated guest accounts outweigh a single promotional claim. They disagree on scale: the photographs show small, visible faults, whereas the press material promises that the hotel exceeds expectations. Triangulation here is a credibility check, not statistical proof.</w:t>
       </w:r>
     </w:p>
     <w:p>
@@ -504,538 +504,9 @@
         <w:pStyle w:val="BodyText"/>
       </w:pPr>
       <w:r>
-        <w:t xml:space="preserve">The photographs show a clear split (Table 1). In the public areas the design intent is consistent and the finish is high: the buffet (Fig. 2), the drinks station (Fig. 3), the lounge (Fig. 4), the ’35 Bar (Fig. 8) and a guest room with walnut headboard, bay window and a framed motorcycle artwork (Fig. 9) all read as premium. The faults sit in surfaces guests touch or look up at: the lift door (Fig. 1), the marble tray top and instant-coffee sachets (Fig. 5), the grille beside the cornice (Fig. 6) and a corridor where an open service door shows a laundry cart (Fig. 7). The corridor point is minor and may simply reflect the tour timing, so it is rated a minor gap.</w:t>
-      </w:r>
-    </w:p>
-    <w:p>
-      <w:pPr>
-        <w:pStyle w:val="BodyText"/>
-      </w:pPr>
-      <w:r>
-        <w:rPr>
-          <w:bCs/>
-          <w:b/>
-        </w:rPr>
-        <w:t xml:space="preserve">Table 1: Photographic evidence by touchpoint</w:t>
-      </w:r>
-    </w:p>
-    <w:tbl>
-      <w:tblPr>
-        <w:tblStyle w:val="Table"/>
-        <w:tblW w:type="pct" w:w="5000"/>
-        <w:tblLook w:firstRow="1" w:lastRow="0" w:firstColumn="0" w:lastColumn="0" w:noHBand="0" w:noVBand="0" w:val="0020"/>
-        <w:jc w:val="start"/>
-      </w:tblPr>
-      <w:tblGrid>
-        <w:gridCol w:w="880"/>
-        <w:gridCol w:w="3960"/>
-        <w:gridCol w:w="1760"/>
-        <w:gridCol w:w="1320"/>
-      </w:tblGrid>
-      <w:tr>
-        <w:trPr>
-          <w:tblHeader w:val="true"/>
-        </w:trPr>
-        <w:tc>
-          <w:tcPr/>
-          <w:p>
-            <w:pPr>
-              <w:pStyle w:val="Compact"/>
-              <w:jc w:val="left"/>
-            </w:pPr>
-            <w:r>
-              <w:t xml:space="preserve">Fig.</w:t>
-            </w:r>
-          </w:p>
-        </w:tc>
-        <w:tc>
-          <w:tcPr/>
-          <w:p>
-            <w:pPr>
-              <w:pStyle w:val="Compact"/>
-              <w:jc w:val="left"/>
-            </w:pPr>
-            <w:r>
-              <w:t xml:space="preserve">What the photograph shows</w:t>
-            </w:r>
-          </w:p>
-        </w:tc>
-        <w:tc>
-          <w:tcPr/>
-          <w:p>
-            <w:pPr>
-              <w:pStyle w:val="Compact"/>
-              <w:jc w:val="left"/>
-            </w:pPr>
-            <w:r>
-              <w:t xml:space="preserve">Kano class</w:t>
-            </w:r>
-          </w:p>
-        </w:tc>
-        <w:tc>
-          <w:tcPr/>
-          <w:p>
-            <w:pPr>
-              <w:pStyle w:val="Compact"/>
-              <w:jc w:val="left"/>
-            </w:pPr>
-            <w:r>
-              <w:t xml:space="preserve">Reading</w:t>
-            </w:r>
-          </w:p>
-        </w:tc>
-      </w:tr>
-      <w:tr>
-        <w:tc>
-          <w:tcPr/>
-          <w:p>
-            <w:pPr>
-              <w:pStyle w:val="Compact"/>
-              <w:jc w:val="left"/>
-            </w:pPr>
-            <w:r>
-              <w:t xml:space="preserve">1</w:t>
-            </w:r>
-          </w:p>
-        </w:tc>
-        <w:tc>
-          <w:tcPr/>
-          <w:p>
-            <w:pPr>
-              <w:pStyle w:val="Compact"/>
-              <w:jc w:val="left"/>
-            </w:pPr>
-            <w:r>
-              <w:t xml:space="preserve">Lift lobby: black marble surround, pediment, brass-coloured door</w:t>
-            </w:r>
-          </w:p>
-        </w:tc>
-        <w:tc>
-          <w:tcPr/>
-          <w:p>
-            <w:pPr>
-              <w:pStyle w:val="Compact"/>
-              <w:jc w:val="left"/>
-            </w:pPr>
-            <w:r>
-              <w:t xml:space="preserve">Must-be</w:t>
-            </w:r>
-          </w:p>
-        </w:tc>
-        <w:tc>
-          <w:tcPr/>
-          <w:p>
-            <w:pPr>
-              <w:pStyle w:val="Compact"/>
-              <w:jc w:val="left"/>
-            </w:pPr>
-            <w:r>
-              <w:t xml:space="preserve">Gap: door finish looks dull and uneven</w:t>
-            </w:r>
-          </w:p>
-        </w:tc>
-      </w:tr>
-      <w:tr>
-        <w:tc>
-          <w:tcPr/>
-          <w:p>
-            <w:pPr>
-              <w:pStyle w:val="Compact"/>
-              <w:jc w:val="left"/>
-            </w:pPr>
-            <w:r>
-              <w:t xml:space="preserve">2</w:t>
-            </w:r>
-          </w:p>
-        </w:tc>
-        <w:tc>
-          <w:tcPr/>
-          <w:p>
-            <w:pPr>
-              <w:pStyle w:val="Compact"/>
-              <w:jc w:val="left"/>
-            </w:pPr>
-            <w:r>
-              <w:t xml:space="preserve">Breakfast counter: lit shelving, GMED oils, hot lamps, linen bread bags, Real Crisps</w:t>
-            </w:r>
-          </w:p>
-        </w:tc>
-        <w:tc>
-          <w:tcPr/>
-          <w:p>
-            <w:pPr>
-              <w:pStyle w:val="Compact"/>
-              <w:jc w:val="left"/>
-            </w:pPr>
-            <w:r>
-              <w:t xml:space="preserve">Attractive</w:t>
-            </w:r>
-          </w:p>
-        </w:tc>
-        <w:tc>
-          <w:tcPr/>
-          <w:p>
-            <w:pPr>
-              <w:pStyle w:val="Compact"/>
-              <w:jc w:val="left"/>
-            </w:pPr>
-            <w:r>
-              <w:t xml:space="preserve">Strength</w:t>
-            </w:r>
-          </w:p>
-        </w:tc>
-      </w:tr>
-      <w:tr>
-        <w:tc>
-          <w:tcPr/>
-          <w:p>
-            <w:pPr>
-              <w:pStyle w:val="Compact"/>
-              <w:jc w:val="left"/>
-            </w:pPr>
-            <w:r>
-              <w:t xml:space="preserve">3</w:t>
-            </w:r>
-          </w:p>
-        </w:tc>
-        <w:tc>
-          <w:tcPr/>
-          <w:p>
-            <w:pPr>
-              <w:pStyle w:val="Compact"/>
-              <w:jc w:val="left"/>
-            </w:pPr>
-            <w:r>
-              <w:t xml:space="preserve">Spanish wines and cava on ice (Codorníu organic, Flama d’Or)</w:t>
-            </w:r>
-          </w:p>
-        </w:tc>
-        <w:tc>
-          <w:tcPr/>
-          <w:p>
-            <w:pPr>
-              <w:pStyle w:val="Compact"/>
-              <w:jc w:val="left"/>
-            </w:pPr>
-            <w:r>
-              <w:t xml:space="preserve">Attractive</w:t>
-            </w:r>
-          </w:p>
-        </w:tc>
-        <w:tc>
-          <w:tcPr/>
-          <w:p>
-            <w:pPr>
-              <w:pStyle w:val="Compact"/>
-              <w:jc w:val="left"/>
-            </w:pPr>
-            <w:r>
-              <w:t xml:space="preserve">Strength: Spanish provenance, one organic product</w:t>
-            </w:r>
-          </w:p>
-        </w:tc>
-      </w:tr>
-      <w:tr>
-        <w:tc>
-          <w:tcPr/>
-          <w:p>
-            <w:pPr>
-              <w:pStyle w:val="Compact"/>
-              <w:jc w:val="left"/>
-            </w:pPr>
-            <w:r>
-              <w:t xml:space="preserve">4</w:t>
-            </w:r>
-          </w:p>
-        </w:tc>
-        <w:tc>
-          <w:tcPr/>
-          <w:p>
-            <w:pPr>
-              <w:pStyle w:val="Compact"/>
-              <w:jc w:val="left"/>
-            </w:pPr>
-            <w:r>
-              <w:t xml:space="preserve">Lounge: long timber table, garden-facing café tables</w:t>
-            </w:r>
-          </w:p>
-        </w:tc>
-        <w:tc>
-          <w:tcPr/>
-          <w:p>
-            <w:pPr>
-              <w:pStyle w:val="Compact"/>
-              <w:jc w:val="left"/>
-            </w:pPr>
-            <w:r>
-              <w:t xml:space="preserve">Attractive</w:t>
-            </w:r>
-          </w:p>
-        </w:tc>
-        <w:tc>
-          <w:tcPr/>
-          <w:p>
-            <w:pPr>
-              <w:pStyle w:val="Compact"/>
-              <w:jc w:val="left"/>
-            </w:pPr>
-            <w:r>
-              <w:t xml:space="preserve">Strength: flexible work-and-dine space</w:t>
-            </w:r>
-          </w:p>
-        </w:tc>
-      </w:tr>
-      <w:tr>
-        <w:tc>
-          <w:tcPr/>
-          <w:p>
-            <w:pPr>
-              <w:pStyle w:val="Compact"/>
-              <w:jc w:val="left"/>
-            </w:pPr>
-            <w:r>
-              <w:t xml:space="preserve">5</w:t>
-            </w:r>
-          </w:p>
-        </w:tc>
-        <w:tc>
-          <w:tcPr/>
-          <w:p>
-            <w:pPr>
-              <w:pStyle w:val="Compact"/>
-              <w:jc w:val="left"/>
-            </w:pPr>
-            <w:r>
-              <w:t xml:space="preserve">Room tea and coffee tray: Nescafé sachets, portion milk, marked marble</w:t>
-            </w:r>
-          </w:p>
-        </w:tc>
-        <w:tc>
-          <w:tcPr/>
-          <w:p>
-            <w:pPr>
-              <w:pStyle w:val="Compact"/>
-              <w:jc w:val="left"/>
-            </w:pPr>
-            <w:r>
-              <w:t xml:space="preserve">Must-be and attractive</w:t>
-            </w:r>
-          </w:p>
-        </w:tc>
-        <w:tc>
-          <w:tcPr/>
-          <w:p>
-            <w:pPr>
-              <w:pStyle w:val="Compact"/>
-              <w:jc w:val="left"/>
-            </w:pPr>
-            <w:r>
-              <w:t xml:space="preserve">Gap: off-brand coffee, surface marks</w:t>
-            </w:r>
-          </w:p>
-        </w:tc>
-      </w:tr>
-      <w:tr>
-        <w:tc>
-          <w:tcPr/>
-          <w:p>
-            <w:pPr>
-              <w:pStyle w:val="Compact"/>
-              <w:jc w:val="left"/>
-            </w:pPr>
-            <w:r>
-              <w:t xml:space="preserve">6</w:t>
-            </w:r>
-          </w:p>
-        </w:tc>
-        <w:tc>
-          <w:tcPr/>
-          <w:p>
-            <w:pPr>
-              <w:pStyle w:val="Compact"/>
-              <w:jc w:val="left"/>
-            </w:pPr>
-            <w:r>
-              <w:t xml:space="preserve">Gym: air-conditioning grille beside cornice</w:t>
-            </w:r>
-          </w:p>
-        </w:tc>
-        <w:tc>
-          <w:tcPr/>
-          <w:p>
-            <w:pPr>
-              <w:pStyle w:val="Compact"/>
-              <w:jc w:val="left"/>
-            </w:pPr>
-            <w:r>
-              <w:t xml:space="preserve">Must-be</w:t>
-            </w:r>
-          </w:p>
-        </w:tc>
-        <w:tc>
-          <w:tcPr/>
-          <w:p>
-            <w:pPr>
-              <w:pStyle w:val="Compact"/>
-              <w:jc w:val="left"/>
-            </w:pPr>
-            <w:r>
-              <w:t xml:space="preserve">Gap: grille looks dusty</w:t>
-            </w:r>
-          </w:p>
-        </w:tc>
-      </w:tr>
-      <w:tr>
-        <w:tc>
-          <w:tcPr/>
-          <w:p>
-            <w:pPr>
-              <w:pStyle w:val="Compact"/>
-              <w:jc w:val="left"/>
-            </w:pPr>
-            <w:r>
-              <w:t xml:space="preserve">7</w:t>
-            </w:r>
-          </w:p>
-        </w:tc>
-        <w:tc>
-          <w:tcPr/>
-          <w:p>
-            <w:pPr>
-              <w:pStyle w:val="Compact"/>
-              <w:jc w:val="left"/>
-            </w:pPr>
-            <w:r>
-              <w:t xml:space="preserve">Corridor: open service door, laundry cart</w:t>
-            </w:r>
-          </w:p>
-        </w:tc>
-        <w:tc>
-          <w:tcPr/>
-          <w:p>
-            <w:pPr>
-              <w:pStyle w:val="Compact"/>
-              <w:jc w:val="left"/>
-            </w:pPr>
-            <w:r>
-              <w:t xml:space="preserve">Must-be</w:t>
-            </w:r>
-          </w:p>
-        </w:tc>
-        <w:tc>
-          <w:tcPr/>
-          <w:p>
-            <w:pPr>
-              <w:pStyle w:val="Compact"/>
-              <w:jc w:val="left"/>
-            </w:pPr>
-            <w:r>
-              <w:t xml:space="preserve">Minor gap: back-of-house visible</w:t>
-            </w:r>
-          </w:p>
-        </w:tc>
-      </w:tr>
-      <w:tr>
-        <w:tc>
-          <w:tcPr/>
-          <w:p>
-            <w:pPr>
-              <w:pStyle w:val="Compact"/>
-              <w:jc w:val="left"/>
-            </w:pPr>
-            <w:r>
-              <w:t xml:space="preserve">8</w:t>
-            </w:r>
-          </w:p>
-        </w:tc>
-        <w:tc>
-          <w:tcPr/>
-          <w:p>
-            <w:pPr>
-              <w:pStyle w:val="Compact"/>
-              <w:jc w:val="left"/>
-            </w:pPr>
-            <w:r>
-              <w:t xml:space="preserve">’35 Bar: walnut cladding, red velvet seating</w:t>
-            </w:r>
-          </w:p>
-        </w:tc>
-        <w:tc>
-          <w:tcPr/>
-          <w:p>
-            <w:pPr>
-              <w:pStyle w:val="Compact"/>
-              <w:jc w:val="left"/>
-            </w:pPr>
-            <w:r>
-              <w:t xml:space="preserve">Attractive</w:t>
-            </w:r>
-          </w:p>
-        </w:tc>
-        <w:tc>
-          <w:tcPr/>
-          <w:p>
-            <w:pPr>
-              <w:pStyle w:val="Compact"/>
-              <w:jc w:val="left"/>
-            </w:pPr>
-            <w:r>
-              <w:t xml:space="preserve">Strength; usage unknown</w:t>
-            </w:r>
-          </w:p>
-        </w:tc>
-      </w:tr>
-      <w:tr>
-        <w:tc>
-          <w:tcPr/>
-          <w:p>
-            <w:pPr>
-              <w:pStyle w:val="Compact"/>
-              <w:jc w:val="left"/>
-            </w:pPr>
-            <w:r>
-              <w:t xml:space="preserve">9</w:t>
-            </w:r>
-          </w:p>
-        </w:tc>
-        <w:tc>
-          <w:tcPr/>
-          <w:p>
-            <w:pPr>
-              <w:pStyle w:val="Compact"/>
-              <w:jc w:val="left"/>
-            </w:pPr>
-            <w:r>
-              <w:t xml:space="preserve">Guest room: walnut headboard, bay window, artwork</w:t>
-            </w:r>
-          </w:p>
-        </w:tc>
-        <w:tc>
-          <w:tcPr/>
-          <w:p>
-            <w:pPr>
-              <w:pStyle w:val="Compact"/>
-              <w:jc w:val="left"/>
-            </w:pPr>
-            <w:r>
-              <w:t xml:space="preserve">Attractive</w:t>
-            </w:r>
-          </w:p>
-        </w:tc>
-        <w:tc>
-          <w:tcPr/>
-          <w:p>
-            <w:pPr>
-              <w:pStyle w:val="Compact"/>
-              <w:jc w:val="left"/>
-            </w:pPr>
-            <w:r>
-              <w:t xml:space="preserve">Strength</w:t>
-            </w:r>
-          </w:p>
-        </w:tc>
-      </w:tr>
-    </w:tbl>
+        <w:t xml:space="preserve">The photographs show a clear split (evidence log in Appendix 1). In the public areas the design intent is consistent and the finish is high: the buffet (Fig. 2), the drinks station (Fig. 3), the lounge (Fig. 4), the ’35 Bar (Fig. 8) and a guest room with walnut headboard, bay window and a framed motorcycle artwork (Fig. 9) all read as premium. The faults sit in surfaces guests touch or look up at: the lift door (Fig. 1), the marble tray top and instant-coffee sachets (Fig. 5), the grille beside the cornice (Fig. 6) and a corridor where an open service door shows a laundry cart (Fig. 7). The corridor point is minor and may reflect tour timing.</w:t>
+      </w:r>
+    </w:p>
     <w:p>
       <w:pPr>
         <w:pStyle w:val="BodyText"/>
@@ -1083,7 +554,7 @@
         <w:pStyle w:val="FirstParagraph"/>
       </w:pPr>
       <w:r>
-        <w:t xml:space="preserve">All costs and timings are the author’s estimates. Each recommendation is tied to evidence and a lens, and Table 2 summarises them.</w:t>
+        <w:t xml:space="preserve">All costs and timings are the author’s estimates. Each recommendation is tied to evidence and a lens, and Appendix 6 gives owners, KPIs and timing.</w:t>
       </w:r>
     </w:p>
     <w:p>
@@ -1205,408 +676,7 @@
         <w:pStyle w:val="BodyText"/>
       </w:pPr>
       <w:r>
-        <w:rPr>
-          <w:bCs/>
-          <w:b/>
-        </w:rPr>
-        <w:t xml:space="preserve">Table 2: Action plan</w:t>
-      </w:r>
-    </w:p>
-    <w:tbl>
-      <w:tblPr>
-        <w:tblStyle w:val="Table"/>
-        <w:tblW w:type="pct" w:w="5000"/>
-        <w:tblLook w:firstRow="1" w:lastRow="0" w:firstColumn="0" w:lastColumn="0" w:noHBand="0" w:noVBand="0" w:val="0020"/>
-        <w:jc w:val="start"/>
-      </w:tblPr>
-      <w:tblGrid>
-        <w:gridCol w:w="540"/>
-        <w:gridCol w:w="1440"/>
-        <w:gridCol w:w="1260"/>
-        <w:gridCol w:w="1440"/>
-        <w:gridCol w:w="2340"/>
-        <w:gridCol w:w="900"/>
-      </w:tblGrid>
-      <w:tr>
-        <w:trPr>
-          <w:tblHeader w:val="true"/>
-        </w:trPr>
-        <w:tc>
-          <w:tcPr/>
-          <w:p>
-            <w:pPr>
-              <w:pStyle w:val="Compact"/>
-              <w:jc w:val="left"/>
-            </w:pPr>
-            <w:r>
-              <w:t xml:space="preserve">#</w:t>
-            </w:r>
-          </w:p>
-        </w:tc>
-        <w:tc>
-          <w:tcPr/>
-          <w:p>
-            <w:pPr>
-              <w:pStyle w:val="Compact"/>
-              <w:jc w:val="left"/>
-            </w:pPr>
-            <w:r>
-              <w:t xml:space="preserve">Action</w:t>
-            </w:r>
-          </w:p>
-        </w:tc>
-        <w:tc>
-          <w:tcPr/>
-          <w:p>
-            <w:pPr>
-              <w:pStyle w:val="Compact"/>
-              <w:jc w:val="left"/>
-            </w:pPr>
-            <w:r>
-              <w:t xml:space="preserve">Owner</w:t>
-            </w:r>
-          </w:p>
-        </w:tc>
-        <w:tc>
-          <w:tcPr/>
-          <w:p>
-            <w:pPr>
-              <w:pStyle w:val="Compact"/>
-              <w:jc w:val="left"/>
-            </w:pPr>
-            <w:r>
-              <w:t xml:space="preserve">Timing</w:t>
-            </w:r>
-          </w:p>
-        </w:tc>
-        <w:tc>
-          <w:tcPr/>
-          <w:p>
-            <w:pPr>
-              <w:pStyle w:val="Compact"/>
-              <w:jc w:val="left"/>
-            </w:pPr>
-            <w:r>
-              <w:t xml:space="preserve">Cost (est.)</w:t>
-            </w:r>
-          </w:p>
-        </w:tc>
-        <w:tc>
-          <w:tcPr/>
-          <w:p>
-            <w:pPr>
-              <w:pStyle w:val="Compact"/>
-              <w:jc w:val="left"/>
-            </w:pPr>
-            <w:r>
-              <w:t xml:space="preserve">KPI</w:t>
-            </w:r>
-          </w:p>
-        </w:tc>
-      </w:tr>
-      <w:tr>
-        <w:tc>
-          <w:tcPr/>
-          <w:p>
-            <w:pPr>
-              <w:pStyle w:val="Compact"/>
-              <w:jc w:val="left"/>
-            </w:pPr>
-            <w:r>
-              <w:t xml:space="preserve">R1</w:t>
-            </w:r>
-          </w:p>
-        </w:tc>
-        <w:tc>
-          <w:tcPr/>
-          <w:p>
-            <w:pPr>
-              <w:pStyle w:val="Compact"/>
-              <w:jc w:val="left"/>
-            </w:pPr>
-            <w:r>
-              <w:t xml:space="preserve">Must-be sweep and weekly walk</w:t>
-            </w:r>
-          </w:p>
-        </w:tc>
-        <w:tc>
-          <w:tcPr/>
-          <w:p>
-            <w:pPr>
-              <w:pStyle w:val="Compact"/>
-              <w:jc w:val="left"/>
-            </w:pPr>
-            <w:r>
-              <w:t xml:space="preserve">Housekeeping / engineering</w:t>
-            </w:r>
-          </w:p>
-        </w:tc>
-        <w:tc>
-          <w:tcPr/>
-          <w:p>
-            <w:pPr>
-              <w:pStyle w:val="Compact"/>
-              <w:jc w:val="left"/>
-            </w:pPr>
-            <w:r>
-              <w:t xml:space="preserve">1-3 months</w:t>
-            </w:r>
-          </w:p>
-        </w:tc>
-        <w:tc>
-          <w:tcPr/>
-          <w:p>
-            <w:pPr>
-              <w:pStyle w:val="Compact"/>
-              <w:jc w:val="left"/>
-            </w:pPr>
-            <w:r>
-              <w:t xml:space="preserve">Low</w:t>
-            </w:r>
-          </w:p>
-        </w:tc>
-        <w:tc>
-          <w:tcPr/>
-          <w:p>
-            <w:pPr>
-              <w:pStyle w:val="Compact"/>
-              <w:jc w:val="left"/>
-            </w:pPr>
-            <w:r>
-              <w:t xml:space="preserve">Checklist pass rate; condition mentions in reviews</w:t>
-            </w:r>
-          </w:p>
-        </w:tc>
-      </w:tr>
-      <w:tr>
-        <w:tc>
-          <w:tcPr/>
-          <w:p>
-            <w:pPr>
-              <w:pStyle w:val="Compact"/>
-              <w:jc w:val="left"/>
-            </w:pPr>
-            <w:r>
-              <w:t xml:space="preserve">R2</w:t>
-            </w:r>
-          </w:p>
-        </w:tc>
-        <w:tc>
-          <w:tcPr/>
-          <w:p>
-            <w:pPr>
-              <w:pStyle w:val="Compact"/>
-              <w:jc w:val="left"/>
-            </w:pPr>
-            <w:r>
-              <w:t xml:space="preserve">Breakfast recovery playbook</w:t>
-            </w:r>
-          </w:p>
-        </w:tc>
-        <w:tc>
-          <w:tcPr/>
-          <w:p>
-            <w:pPr>
-              <w:pStyle w:val="Compact"/>
-              <w:jc w:val="left"/>
-            </w:pPr>
-            <w:r>
-              <w:t xml:space="preserve">F&amp;B / guest services</w:t>
-            </w:r>
-          </w:p>
-        </w:tc>
-        <w:tc>
-          <w:tcPr/>
-          <w:p>
-            <w:pPr>
-              <w:pStyle w:val="Compact"/>
-              <w:jc w:val="left"/>
-            </w:pPr>
-            <w:r>
-              <w:t xml:space="preserve">~1 month</w:t>
-            </w:r>
-          </w:p>
-        </w:tc>
-        <w:tc>
-          <w:tcPr/>
-          <w:p>
-            <w:pPr>
-              <w:pStyle w:val="Compact"/>
-              <w:jc w:val="left"/>
-            </w:pPr>
-            <w:r>
-              <w:t xml:space="preserve">Low</w:t>
-            </w:r>
-          </w:p>
-        </w:tc>
-        <w:tc>
-          <w:tcPr/>
-          <w:p>
-            <w:pPr>
-              <w:pStyle w:val="Compact"/>
-              <w:jc w:val="left"/>
-            </w:pPr>
-            <w:r>
-              <w:t xml:space="preserve">Time to first response; make-good rate</w:t>
-            </w:r>
-          </w:p>
-        </w:tc>
-      </w:tr>
-      <w:tr>
-        <w:tc>
-          <w:tcPr/>
-          <w:p>
-            <w:pPr>
-              <w:pStyle w:val="Compact"/>
-              <w:jc w:val="left"/>
-            </w:pPr>
-            <w:r>
-              <w:t xml:space="preserve">R3</w:t>
-            </w:r>
-          </w:p>
-        </w:tc>
-        <w:tc>
-          <w:tcPr/>
-          <w:p>
-            <w:pPr>
-              <w:pStyle w:val="Compact"/>
-              <w:jc w:val="left"/>
-            </w:pPr>
-            <w:r>
-              <w:t xml:space="preserve">Spanish in-room kit (pilot floor)</w:t>
-            </w:r>
-          </w:p>
-        </w:tc>
-        <w:tc>
-          <w:tcPr/>
-          <w:p>
-            <w:pPr>
-              <w:pStyle w:val="Compact"/>
-              <w:jc w:val="left"/>
-            </w:pPr>
-            <w:r>
-              <w:t xml:space="preserve">Rooms division / F&amp;B</w:t>
-            </w:r>
-          </w:p>
-        </w:tc>
-        <w:tc>
-          <w:tcPr/>
-          <w:p>
-            <w:pPr>
-              <w:pStyle w:val="Compact"/>
-              <w:jc w:val="left"/>
-            </w:pPr>
-            <w:r>
-              <w:t xml:space="preserve">~3 months</w:t>
-            </w:r>
-          </w:p>
-        </w:tc>
-        <w:tc>
-          <w:tcPr/>
-          <w:p>
-            <w:pPr>
-              <w:pStyle w:val="Compact"/>
-              <w:jc w:val="left"/>
-            </w:pPr>
-            <w:r>
-              <w:t xml:space="preserve">Low to medium</w:t>
-            </w:r>
-          </w:p>
-        </w:tc>
-        <w:tc>
-          <w:tcPr/>
-          <w:p>
-            <w:pPr>
-              <w:pStyle w:val="Compact"/>
-              <w:jc w:val="left"/>
-            </w:pPr>
-            <w:r>
-              <w:t xml:space="preserve">In-room F&amp;B mentions; minibar spend</w:t>
-            </w:r>
-          </w:p>
-        </w:tc>
-      </w:tr>
-      <w:tr>
-        <w:tc>
-          <w:tcPr/>
-          <w:p>
-            <w:pPr>
-              <w:pStyle w:val="Compact"/>
-              <w:jc w:val="left"/>
-            </w:pPr>
-            <w:r>
-              <w:t xml:space="preserve">R4</w:t>
-            </w:r>
-          </w:p>
-        </w:tc>
-        <w:tc>
-          <w:tcPr/>
-          <w:p>
-            <w:pPr>
-              <w:pStyle w:val="Compact"/>
-              <w:jc w:val="left"/>
-            </w:pPr>
-            <w:r>
-              <w:t xml:space="preserve">Track The Level</w:t>
-            </w:r>
-          </w:p>
-        </w:tc>
-        <w:tc>
-          <w:tcPr/>
-          <w:p>
-            <w:pPr>
-              <w:pStyle w:val="Compact"/>
-              <w:jc w:val="left"/>
-            </w:pPr>
-            <w:r>
-              <w:t xml:space="preserve">Revenue / F&amp;B</w:t>
-            </w:r>
-          </w:p>
-        </w:tc>
-        <w:tc>
-          <w:tcPr/>
-          <w:p>
-            <w:pPr>
-              <w:pStyle w:val="Compact"/>
-              <w:jc w:val="left"/>
-            </w:pPr>
-            <w:r>
-              <w:t xml:space="preserve">~2 months</w:t>
-            </w:r>
-          </w:p>
-        </w:tc>
-        <w:tc>
-          <w:tcPr/>
-          <w:p>
-            <w:pPr>
-              <w:pStyle w:val="Compact"/>
-              <w:jc w:val="left"/>
-            </w:pPr>
-            <w:r>
-              <w:t xml:space="preserve">Low</w:t>
-            </w:r>
-          </w:p>
-        </w:tc>
-        <w:tc>
-          <w:tcPr/>
-          <w:p>
-            <w:pPr>
-              <w:pStyle w:val="Compact"/>
-              <w:jc w:val="left"/>
-            </w:pPr>
-            <w:r>
-              <w:t xml:space="preserve">Desk occupancy; redemption rate; spend per pass</w:t>
-            </w:r>
-          </w:p>
-        </w:tc>
-      </w:tr>
-    </w:tbl>
-    <w:p>
-      <w:pPr>
-        <w:pStyle w:val="BodyText"/>
-      </w:pPr>
-      <w:r>
-        <w:t xml:space="preserve">The priority order, by impact against effort, is R2 and R1 first as the cheapest and most visible, R4 next, and R3 last because it needs the most money and testing. R1 to R3 address must-be reliability and expectation, which the evidence suggests are the main sources of dissatisfaction, and they draw on different teams, so they can run in parallel. The order should be adjusted once the review sample shows which touchpoint causes most complaints. Judge success after one quarter against the stated indicators, using the same review-coding frame so results compare with this study’s baseline, and redesign any item that shows no movement before spending more. A 90-day timeline is in Appendix 6.</w:t>
+        <w:t xml:space="preserve">The priority order, by impact against effort, is R2 and R1 first as the cheapest and most visible, R4 next, and R3 last because it needs the most money and testing. R1 to R3 address must-be reliability and expectation, which the evidence suggests are the main sources of dissatisfaction, and they draw on different teams, so they can run in parallel. Judge success after one quarter against the stated indicators, using the same review-coding frame so results compare with this study’s baseline, and redesign any item that shows no movement before spending more. A 90-day timeline is in Appendix 6.</w:t>
       </w:r>
     </w:p>
     <w:bookmarkEnd w:id="25"/>
@@ -1624,7 +694,7 @@
         <w:pStyle w:val="FirstParagraph"/>
       </w:pPr>
       <w:r>
-        <w:t xml:space="preserve">Meliá White House largely delivers its premium promise where guests look first, in public spaces, breakfast and the bar, but under-delivers on condition and consistency, which matters more at £300 than at £117. These findings rest on one hosted visit, photographic and document evidence and a small, self-selected review sample. The hotel should first fix breakfast continuity and its must-be basics, because they are cheap, fast and protect the investment already made. Further work should test the pattern against a larger review set and management data.</w:t>
+        <w:t xml:space="preserve">Meliá White House largely delivers its premium promise where guests look first, in public spaces, breakfast and the bar, but under-delivers on condition and consistency, which matters more at £300 than at £117. These findings rest on one hosted visit, photographic and document evidence and a small, self-selected review sample. The hotel should first fix breakfast continuity and its must-be basics, because they are cheap, fast and protect the investment already made.</w:t>
       </w:r>
     </w:p>
     <w:bookmarkEnd w:id="26"/>
@@ -1837,27 +907,6 @@
         <w:pStyle w:val="BodyText"/>
       </w:pPr>
       <w:r>
-        <w:t xml:space="preserve">Davis, B., Lockwood, A., Alcott, P. and Pantelidis, I.S. (2018)</w:t>
-      </w:r>
-      <w:r>
-        <w:t xml:space="preserve"> </w:t>
-      </w:r>
-      <w:r>
-        <w:rPr>
-          <w:iCs/>
-          <w:i/>
-        </w:rPr>
-        <w:t xml:space="preserve">Food and Beverage Management</w:t>
-      </w:r>
-      <w:r>
-        <w:t xml:space="preserve">. 5th edn. Abingdon: Routledge.</w:t>
-      </w:r>
-    </w:p>
-    <w:p>
-      <w:pPr>
-        <w:pStyle w:val="BodyText"/>
-      </w:pPr>
-      <w:r>
         <w:t xml:space="preserve">Denzin, N.K. (1978)</w:t>
       </w:r>
       <w:r>
@@ -2065,6 +1114,27 @@
         <w:pStyle w:val="BodyText"/>
       </w:pPr>
       <w:r>
+        <w:t xml:space="preserve">Historic England (n.d.)</w:t>
+      </w:r>
+      <w:r>
+        <w:t xml:space="preserve"> </w:t>
+      </w:r>
+      <w:r>
+        <w:rPr>
+          <w:iCs/>
+          <w:i/>
+        </w:rPr>
+        <w:t xml:space="preserve">National Heritage List for England: The White House, Albany Street</w:t>
+      </w:r>
+      <w:r>
+        <w:t xml:space="preserve">, list entry 1113231. Available at: https://historicengland.org.uk/listing/the-list/list-entry/1113231 (Accessed: 8 October 2026).</w:t>
+      </w:r>
+    </w:p>
+    <w:p>
+      <w:pPr>
+        <w:pStyle w:val="BodyText"/>
+      </w:pPr>
+      <w:r>
         <w:t xml:space="preserve">Hospitality Net (2023)</w:t>
       </w:r>
       <w:r>
@@ -2486,6 +1556,42 @@
       </w:r>
       <w:r>
         <w:t xml:space="preserve">, 36(3), pp. 356-372.</w:t>
+      </w:r>
+    </w:p>
+    <w:p>
+      <w:pPr>
+        <w:pStyle w:val="BodyText"/>
+      </w:pPr>
+      <w:r>
+        <w:t xml:space="preserve">Sparks, B.A. and Browning, V. (2011)</w:t>
+      </w:r>
+      <w:r>
+        <w:t xml:space="preserve"> </w:t>
+      </w:r>
+      <w:r>
+        <w:t xml:space="preserve">‘</w:t>
+      </w:r>
+      <w:r>
+        <w:t xml:space="preserve">The impact of online reviews on hotel booking intentions and perception of trust</w:t>
+      </w:r>
+      <w:r>
+        <w:t xml:space="preserve">’</w:t>
+      </w:r>
+      <w:r>
+        <w:t xml:space="preserve">,</w:t>
+      </w:r>
+      <w:r>
+        <w:t xml:space="preserve"> </w:t>
+      </w:r>
+      <w:r>
+        <w:rPr>
+          <w:iCs/>
+          <w:i/>
+        </w:rPr>
+        <w:t xml:space="preserve">Tourism Management</w:t>
+      </w:r>
+      <w:r>
+        <w:t xml:space="preserve">, 32(6), pp. 1310-1323.</w:t>
       </w:r>
     </w:p>
     <w:p>
@@ -3232,6 +2338,535 @@
         <w:t xml:space="preserve">Figure 9. Guest room with walnut headboard, bay window and artwork.</w:t>
       </w:r>
     </w:p>
+    <w:p>
+      <w:pPr>
+        <w:pStyle w:val="BodyText"/>
+      </w:pPr>
+      <w:r>
+        <w:rPr>
+          <w:bCs/>
+          <w:b/>
+        </w:rPr>
+        <w:t xml:space="preserve">Photographic evidence log</w:t>
+      </w:r>
+    </w:p>
+    <w:tbl>
+      <w:tblPr>
+        <w:tblStyle w:val="Table"/>
+        <w:tblW w:type="pct" w:w="5000"/>
+        <w:tblLook w:firstRow="1" w:lastRow="0" w:firstColumn="0" w:lastColumn="0" w:noHBand="0" w:noVBand="0" w:val="0020"/>
+        <w:jc w:val="start"/>
+      </w:tblPr>
+      <w:tblGrid>
+        <w:gridCol w:w="880"/>
+        <w:gridCol w:w="3960"/>
+        <w:gridCol w:w="1760"/>
+        <w:gridCol w:w="1320"/>
+      </w:tblGrid>
+      <w:tr>
+        <w:trPr>
+          <w:tblHeader w:val="true"/>
+        </w:trPr>
+        <w:tc>
+          <w:tcPr/>
+          <w:p>
+            <w:pPr>
+              <w:pStyle w:val="Compact"/>
+              <w:jc w:val="left"/>
+            </w:pPr>
+            <w:r>
+              <w:t xml:space="preserve">Fig.</w:t>
+            </w:r>
+          </w:p>
+        </w:tc>
+        <w:tc>
+          <w:tcPr/>
+          <w:p>
+            <w:pPr>
+              <w:pStyle w:val="Compact"/>
+              <w:jc w:val="left"/>
+            </w:pPr>
+            <w:r>
+              <w:t xml:space="preserve">What the photograph shows</w:t>
+            </w:r>
+          </w:p>
+        </w:tc>
+        <w:tc>
+          <w:tcPr/>
+          <w:p>
+            <w:pPr>
+              <w:pStyle w:val="Compact"/>
+              <w:jc w:val="left"/>
+            </w:pPr>
+            <w:r>
+              <w:t xml:space="preserve">Kano class</w:t>
+            </w:r>
+          </w:p>
+        </w:tc>
+        <w:tc>
+          <w:tcPr/>
+          <w:p>
+            <w:pPr>
+              <w:pStyle w:val="Compact"/>
+              <w:jc w:val="left"/>
+            </w:pPr>
+            <w:r>
+              <w:t xml:space="preserve">Reading</w:t>
+            </w:r>
+          </w:p>
+        </w:tc>
+      </w:tr>
+      <w:tr>
+        <w:tc>
+          <w:tcPr/>
+          <w:p>
+            <w:pPr>
+              <w:pStyle w:val="Compact"/>
+              <w:jc w:val="left"/>
+            </w:pPr>
+            <w:r>
+              <w:t xml:space="preserve">1</w:t>
+            </w:r>
+          </w:p>
+        </w:tc>
+        <w:tc>
+          <w:tcPr/>
+          <w:p>
+            <w:pPr>
+              <w:pStyle w:val="Compact"/>
+              <w:jc w:val="left"/>
+            </w:pPr>
+            <w:r>
+              <w:t xml:space="preserve">Lift lobby: black marble surround, pediment, brass-coloured door</w:t>
+            </w:r>
+          </w:p>
+        </w:tc>
+        <w:tc>
+          <w:tcPr/>
+          <w:p>
+            <w:pPr>
+              <w:pStyle w:val="Compact"/>
+              <w:jc w:val="left"/>
+            </w:pPr>
+            <w:r>
+              <w:t xml:space="preserve">Must-be</w:t>
+            </w:r>
+          </w:p>
+        </w:tc>
+        <w:tc>
+          <w:tcPr/>
+          <w:p>
+            <w:pPr>
+              <w:pStyle w:val="Compact"/>
+              <w:jc w:val="left"/>
+            </w:pPr>
+            <w:r>
+              <w:t xml:space="preserve">Gap: door finish looks dull and uneven</w:t>
+            </w:r>
+          </w:p>
+        </w:tc>
+      </w:tr>
+      <w:tr>
+        <w:tc>
+          <w:tcPr/>
+          <w:p>
+            <w:pPr>
+              <w:pStyle w:val="Compact"/>
+              <w:jc w:val="left"/>
+            </w:pPr>
+            <w:r>
+              <w:t xml:space="preserve">2</w:t>
+            </w:r>
+          </w:p>
+        </w:tc>
+        <w:tc>
+          <w:tcPr/>
+          <w:p>
+            <w:pPr>
+              <w:pStyle w:val="Compact"/>
+              <w:jc w:val="left"/>
+            </w:pPr>
+            <w:r>
+              <w:t xml:space="preserve">Breakfast counter: lit shelving, GMED oils, hot lamps, linen bread bags, Real Crisps</w:t>
+            </w:r>
+          </w:p>
+        </w:tc>
+        <w:tc>
+          <w:tcPr/>
+          <w:p>
+            <w:pPr>
+              <w:pStyle w:val="Compact"/>
+              <w:jc w:val="left"/>
+            </w:pPr>
+            <w:r>
+              <w:t xml:space="preserve">Attractive</w:t>
+            </w:r>
+          </w:p>
+        </w:tc>
+        <w:tc>
+          <w:tcPr/>
+          <w:p>
+            <w:pPr>
+              <w:pStyle w:val="Compact"/>
+              <w:jc w:val="left"/>
+            </w:pPr>
+            <w:r>
+              <w:t xml:space="preserve">Strength</w:t>
+            </w:r>
+          </w:p>
+        </w:tc>
+      </w:tr>
+      <w:tr>
+        <w:tc>
+          <w:tcPr/>
+          <w:p>
+            <w:pPr>
+              <w:pStyle w:val="Compact"/>
+              <w:jc w:val="left"/>
+            </w:pPr>
+            <w:r>
+              <w:t xml:space="preserve">3</w:t>
+            </w:r>
+          </w:p>
+        </w:tc>
+        <w:tc>
+          <w:tcPr/>
+          <w:p>
+            <w:pPr>
+              <w:pStyle w:val="Compact"/>
+              <w:jc w:val="left"/>
+            </w:pPr>
+            <w:r>
+              <w:t xml:space="preserve">Spanish wines and cava on ice (Codorníu organic, Flama d’Or)</w:t>
+            </w:r>
+          </w:p>
+        </w:tc>
+        <w:tc>
+          <w:tcPr/>
+          <w:p>
+            <w:pPr>
+              <w:pStyle w:val="Compact"/>
+              <w:jc w:val="left"/>
+            </w:pPr>
+            <w:r>
+              <w:t xml:space="preserve">Attractive</w:t>
+            </w:r>
+          </w:p>
+        </w:tc>
+        <w:tc>
+          <w:tcPr/>
+          <w:p>
+            <w:pPr>
+              <w:pStyle w:val="Compact"/>
+              <w:jc w:val="left"/>
+            </w:pPr>
+            <w:r>
+              <w:t xml:space="preserve">Strength: Spanish provenance, one organic product</w:t>
+            </w:r>
+          </w:p>
+        </w:tc>
+      </w:tr>
+      <w:tr>
+        <w:tc>
+          <w:tcPr/>
+          <w:p>
+            <w:pPr>
+              <w:pStyle w:val="Compact"/>
+              <w:jc w:val="left"/>
+            </w:pPr>
+            <w:r>
+              <w:t xml:space="preserve">4</w:t>
+            </w:r>
+          </w:p>
+        </w:tc>
+        <w:tc>
+          <w:tcPr/>
+          <w:p>
+            <w:pPr>
+              <w:pStyle w:val="Compact"/>
+              <w:jc w:val="left"/>
+            </w:pPr>
+            <w:r>
+              <w:t xml:space="preserve">Lounge: long timber table, garden-facing café tables</w:t>
+            </w:r>
+          </w:p>
+        </w:tc>
+        <w:tc>
+          <w:tcPr/>
+          <w:p>
+            <w:pPr>
+              <w:pStyle w:val="Compact"/>
+              <w:jc w:val="left"/>
+            </w:pPr>
+            <w:r>
+              <w:t xml:space="preserve">Attractive</w:t>
+            </w:r>
+          </w:p>
+        </w:tc>
+        <w:tc>
+          <w:tcPr/>
+          <w:p>
+            <w:pPr>
+              <w:pStyle w:val="Compact"/>
+              <w:jc w:val="left"/>
+            </w:pPr>
+            <w:r>
+              <w:t xml:space="preserve">Strength: flexible work-and-dine space</w:t>
+            </w:r>
+          </w:p>
+        </w:tc>
+      </w:tr>
+      <w:tr>
+        <w:tc>
+          <w:tcPr/>
+          <w:p>
+            <w:pPr>
+              <w:pStyle w:val="Compact"/>
+              <w:jc w:val="left"/>
+            </w:pPr>
+            <w:r>
+              <w:t xml:space="preserve">5</w:t>
+            </w:r>
+          </w:p>
+        </w:tc>
+        <w:tc>
+          <w:tcPr/>
+          <w:p>
+            <w:pPr>
+              <w:pStyle w:val="Compact"/>
+              <w:jc w:val="left"/>
+            </w:pPr>
+            <w:r>
+              <w:t xml:space="preserve">Room tea and coffee tray: Nescafé sachets, portion milk, marked marble</w:t>
+            </w:r>
+          </w:p>
+        </w:tc>
+        <w:tc>
+          <w:tcPr/>
+          <w:p>
+            <w:pPr>
+              <w:pStyle w:val="Compact"/>
+              <w:jc w:val="left"/>
+            </w:pPr>
+            <w:r>
+              <w:t xml:space="preserve">Must-be and attractive</w:t>
+            </w:r>
+          </w:p>
+        </w:tc>
+        <w:tc>
+          <w:tcPr/>
+          <w:p>
+            <w:pPr>
+              <w:pStyle w:val="Compact"/>
+              <w:jc w:val="left"/>
+            </w:pPr>
+            <w:r>
+              <w:t xml:space="preserve">Gap: off-brand coffee, surface marks</w:t>
+            </w:r>
+          </w:p>
+        </w:tc>
+      </w:tr>
+      <w:tr>
+        <w:tc>
+          <w:tcPr/>
+          <w:p>
+            <w:pPr>
+              <w:pStyle w:val="Compact"/>
+              <w:jc w:val="left"/>
+            </w:pPr>
+            <w:r>
+              <w:t xml:space="preserve">6</w:t>
+            </w:r>
+          </w:p>
+        </w:tc>
+        <w:tc>
+          <w:tcPr/>
+          <w:p>
+            <w:pPr>
+              <w:pStyle w:val="Compact"/>
+              <w:jc w:val="left"/>
+            </w:pPr>
+            <w:r>
+              <w:t xml:space="preserve">Gym: air-conditioning grille beside cornice</w:t>
+            </w:r>
+          </w:p>
+        </w:tc>
+        <w:tc>
+          <w:tcPr/>
+          <w:p>
+            <w:pPr>
+              <w:pStyle w:val="Compact"/>
+              <w:jc w:val="left"/>
+            </w:pPr>
+            <w:r>
+              <w:t xml:space="preserve">Must-be</w:t>
+            </w:r>
+          </w:p>
+        </w:tc>
+        <w:tc>
+          <w:tcPr/>
+          <w:p>
+            <w:pPr>
+              <w:pStyle w:val="Compact"/>
+              <w:jc w:val="left"/>
+            </w:pPr>
+            <w:r>
+              <w:t xml:space="preserve">Gap: grille looks dusty</w:t>
+            </w:r>
+          </w:p>
+        </w:tc>
+      </w:tr>
+      <w:tr>
+        <w:tc>
+          <w:tcPr/>
+          <w:p>
+            <w:pPr>
+              <w:pStyle w:val="Compact"/>
+              <w:jc w:val="left"/>
+            </w:pPr>
+            <w:r>
+              <w:t xml:space="preserve">7</w:t>
+            </w:r>
+          </w:p>
+        </w:tc>
+        <w:tc>
+          <w:tcPr/>
+          <w:p>
+            <w:pPr>
+              <w:pStyle w:val="Compact"/>
+              <w:jc w:val="left"/>
+            </w:pPr>
+            <w:r>
+              <w:t xml:space="preserve">Corridor: open service door, laundry cart</w:t>
+            </w:r>
+          </w:p>
+        </w:tc>
+        <w:tc>
+          <w:tcPr/>
+          <w:p>
+            <w:pPr>
+              <w:pStyle w:val="Compact"/>
+              <w:jc w:val="left"/>
+            </w:pPr>
+            <w:r>
+              <w:t xml:space="preserve">Must-be</w:t>
+            </w:r>
+          </w:p>
+        </w:tc>
+        <w:tc>
+          <w:tcPr/>
+          <w:p>
+            <w:pPr>
+              <w:pStyle w:val="Compact"/>
+              <w:jc w:val="left"/>
+            </w:pPr>
+            <w:r>
+              <w:t xml:space="preserve">Minor gap: back-of-house visible</w:t>
+            </w:r>
+          </w:p>
+        </w:tc>
+      </w:tr>
+      <w:tr>
+        <w:tc>
+          <w:tcPr/>
+          <w:p>
+            <w:pPr>
+              <w:pStyle w:val="Compact"/>
+              <w:jc w:val="left"/>
+            </w:pPr>
+            <w:r>
+              <w:t xml:space="preserve">8</w:t>
+            </w:r>
+          </w:p>
+        </w:tc>
+        <w:tc>
+          <w:tcPr/>
+          <w:p>
+            <w:pPr>
+              <w:pStyle w:val="Compact"/>
+              <w:jc w:val="left"/>
+            </w:pPr>
+            <w:r>
+              <w:t xml:space="preserve">’35 Bar: walnut cladding, red velvet seating</w:t>
+            </w:r>
+          </w:p>
+        </w:tc>
+        <w:tc>
+          <w:tcPr/>
+          <w:p>
+            <w:pPr>
+              <w:pStyle w:val="Compact"/>
+              <w:jc w:val="left"/>
+            </w:pPr>
+            <w:r>
+              <w:t xml:space="preserve">Attractive</w:t>
+            </w:r>
+          </w:p>
+        </w:tc>
+        <w:tc>
+          <w:tcPr/>
+          <w:p>
+            <w:pPr>
+              <w:pStyle w:val="Compact"/>
+              <w:jc w:val="left"/>
+            </w:pPr>
+            <w:r>
+              <w:t xml:space="preserve">Strength; usage unknown</w:t>
+            </w:r>
+          </w:p>
+        </w:tc>
+      </w:tr>
+      <w:tr>
+        <w:tc>
+          <w:tcPr/>
+          <w:p>
+            <w:pPr>
+              <w:pStyle w:val="Compact"/>
+              <w:jc w:val="left"/>
+            </w:pPr>
+            <w:r>
+              <w:t xml:space="preserve">9</w:t>
+            </w:r>
+          </w:p>
+        </w:tc>
+        <w:tc>
+          <w:tcPr/>
+          <w:p>
+            <w:pPr>
+              <w:pStyle w:val="Compact"/>
+              <w:jc w:val="left"/>
+            </w:pPr>
+            <w:r>
+              <w:t xml:space="preserve">Guest room: walnut headboard, bay window, artwork</w:t>
+            </w:r>
+          </w:p>
+        </w:tc>
+        <w:tc>
+          <w:tcPr/>
+          <w:p>
+            <w:pPr>
+              <w:pStyle w:val="Compact"/>
+              <w:jc w:val="left"/>
+            </w:pPr>
+            <w:r>
+              <w:t xml:space="preserve">Attractive</w:t>
+            </w:r>
+          </w:p>
+        </w:tc>
+        <w:tc>
+          <w:tcPr/>
+          <w:p>
+            <w:pPr>
+              <w:pStyle w:val="Compact"/>
+              <w:jc w:val="left"/>
+            </w:pPr>
+            <w:r>
+              <w:t xml:space="preserve">Strength</w:t>
+            </w:r>
+          </w:p>
+        </w:tc>
+      </w:tr>
+    </w:tbl>
     <w:bookmarkEnd w:id="55"/>
     <w:bookmarkStart w:id="56" w:name="appendix-2-source-map"/>
     <w:p>
@@ -3429,7 +3064,7 @@
               <w:jc w:val="left"/>
             </w:pPr>
             <w:r>
-              <w:t xml:space="preserve">Camden planning documents</w:t>
+              <w:t xml:space="preserve">Camden planning documents; Historic England list entry</w:t>
             </w:r>
           </w:p>
         </w:tc>
@@ -3857,31 +3492,31 @@
               <w:jc w:val="left"/>
             </w:pPr>
             <w:r>
-              <w:t xml:space="preserve">Grade II listed, 1930s building</w:t>
-            </w:r>
-          </w:p>
-        </w:tc>
-        <w:tc>
-          <w:tcPr/>
-          <w:p>
-            <w:pPr>
-              <w:pStyle w:val="Compact"/>
-              <w:jc w:val="left"/>
-            </w:pPr>
-            <w:r>
-              <w:t xml:space="preserve">Camden documents; trade press</w:t>
-            </w:r>
-          </w:p>
-        </w:tc>
-        <w:tc>
-          <w:tcPr/>
-          <w:p>
-            <w:pPr>
-              <w:pStyle w:val="Compact"/>
-              <w:jc w:val="left"/>
-            </w:pPr>
-            <w:r>
-              <w:t xml:space="preserve">Consistent across sources; cross-check the Historic England list entry (not yet done)</w:t>
+              <w:t xml:space="preserve">Grade II listed; built 1936; nine storeys, star-shaped plan</w:t>
+            </w:r>
+          </w:p>
+        </w:tc>
+        <w:tc>
+          <w:tcPr/>
+          <w:p>
+            <w:pPr>
+              <w:pStyle w:val="Compact"/>
+              <w:jc w:val="left"/>
+            </w:pPr>
+            <w:r>
+              <w:t xml:space="preserve">Historic England list entry 1113231</w:t>
+            </w:r>
+          </w:p>
+        </w:tc>
+        <w:tc>
+          <w:tcPr/>
+          <w:p>
+            <w:pPr>
+              <w:pStyle w:val="Compact"/>
+              <w:jc w:val="left"/>
+            </w:pPr>
+            <w:r>
+              <w:t xml:space="preserve">Matches search summary of the entry (listed 11 January 1999); confirm on the page</w:t>
             </w:r>
           </w:p>
         </w:tc>
@@ -5246,6 +4881,407 @@
             </w:pPr>
             <w:r>
               <w:t xml:space="preserve">One-floor pilot; review of mentions and spend; roll-out decision</w:t>
+            </w:r>
+          </w:p>
+        </w:tc>
+      </w:tr>
+    </w:tbl>
+    <w:p>
+      <w:pPr>
+        <w:pStyle w:val="BodyText"/>
+      </w:pPr>
+      <w:r>
+        <w:rPr>
+          <w:bCs/>
+          <w:b/>
+        </w:rPr>
+        <w:t xml:space="preserve">Action plan: owners, KPIs and estimates</w:t>
+      </w:r>
+    </w:p>
+    <w:tbl>
+      <w:tblPr>
+        <w:tblStyle w:val="Table"/>
+        <w:tblW w:type="pct" w:w="5000"/>
+        <w:tblLook w:firstRow="1" w:lastRow="0" w:firstColumn="0" w:lastColumn="0" w:noHBand="0" w:noVBand="0" w:val="0020"/>
+        <w:jc w:val="start"/>
+      </w:tblPr>
+      <w:tblGrid>
+        <w:gridCol w:w="540"/>
+        <w:gridCol w:w="1440"/>
+        <w:gridCol w:w="1260"/>
+        <w:gridCol w:w="1440"/>
+        <w:gridCol w:w="2340"/>
+        <w:gridCol w:w="900"/>
+      </w:tblGrid>
+      <w:tr>
+        <w:trPr>
+          <w:tblHeader w:val="true"/>
+        </w:trPr>
+        <w:tc>
+          <w:tcPr/>
+          <w:p>
+            <w:pPr>
+              <w:pStyle w:val="Compact"/>
+              <w:jc w:val="left"/>
+            </w:pPr>
+            <w:r>
+              <w:t xml:space="preserve">#</w:t>
+            </w:r>
+          </w:p>
+        </w:tc>
+        <w:tc>
+          <w:tcPr/>
+          <w:p>
+            <w:pPr>
+              <w:pStyle w:val="Compact"/>
+              <w:jc w:val="left"/>
+            </w:pPr>
+            <w:r>
+              <w:t xml:space="preserve">Action</w:t>
+            </w:r>
+          </w:p>
+        </w:tc>
+        <w:tc>
+          <w:tcPr/>
+          <w:p>
+            <w:pPr>
+              <w:pStyle w:val="Compact"/>
+              <w:jc w:val="left"/>
+            </w:pPr>
+            <w:r>
+              <w:t xml:space="preserve">Owner</w:t>
+            </w:r>
+          </w:p>
+        </w:tc>
+        <w:tc>
+          <w:tcPr/>
+          <w:p>
+            <w:pPr>
+              <w:pStyle w:val="Compact"/>
+              <w:jc w:val="left"/>
+            </w:pPr>
+            <w:r>
+              <w:t xml:space="preserve">Timing</w:t>
+            </w:r>
+          </w:p>
+        </w:tc>
+        <w:tc>
+          <w:tcPr/>
+          <w:p>
+            <w:pPr>
+              <w:pStyle w:val="Compact"/>
+              <w:jc w:val="left"/>
+            </w:pPr>
+            <w:r>
+              <w:t xml:space="preserve">Cost (est.)</w:t>
+            </w:r>
+          </w:p>
+        </w:tc>
+        <w:tc>
+          <w:tcPr/>
+          <w:p>
+            <w:pPr>
+              <w:pStyle w:val="Compact"/>
+              <w:jc w:val="left"/>
+            </w:pPr>
+            <w:r>
+              <w:t xml:space="preserve">KPI</w:t>
+            </w:r>
+          </w:p>
+        </w:tc>
+      </w:tr>
+      <w:tr>
+        <w:tc>
+          <w:tcPr/>
+          <w:p>
+            <w:pPr>
+              <w:pStyle w:val="Compact"/>
+              <w:jc w:val="left"/>
+            </w:pPr>
+            <w:r>
+              <w:t xml:space="preserve">R1</w:t>
+            </w:r>
+          </w:p>
+        </w:tc>
+        <w:tc>
+          <w:tcPr/>
+          <w:p>
+            <w:pPr>
+              <w:pStyle w:val="Compact"/>
+              <w:jc w:val="left"/>
+            </w:pPr>
+            <w:r>
+              <w:t xml:space="preserve">Must-be sweep and weekly walk</w:t>
+            </w:r>
+          </w:p>
+        </w:tc>
+        <w:tc>
+          <w:tcPr/>
+          <w:p>
+            <w:pPr>
+              <w:pStyle w:val="Compact"/>
+              <w:jc w:val="left"/>
+            </w:pPr>
+            <w:r>
+              <w:t xml:space="preserve">Housekeeping / engineering</w:t>
+            </w:r>
+          </w:p>
+        </w:tc>
+        <w:tc>
+          <w:tcPr/>
+          <w:p>
+            <w:pPr>
+              <w:pStyle w:val="Compact"/>
+              <w:jc w:val="left"/>
+            </w:pPr>
+            <w:r>
+              <w:t xml:space="preserve">1-3 months</w:t>
+            </w:r>
+          </w:p>
+        </w:tc>
+        <w:tc>
+          <w:tcPr/>
+          <w:p>
+            <w:pPr>
+              <w:pStyle w:val="Compact"/>
+              <w:jc w:val="left"/>
+            </w:pPr>
+            <w:r>
+              <w:t xml:space="preserve">Low</w:t>
+            </w:r>
+          </w:p>
+        </w:tc>
+        <w:tc>
+          <w:tcPr/>
+          <w:p>
+            <w:pPr>
+              <w:pStyle w:val="Compact"/>
+              <w:jc w:val="left"/>
+            </w:pPr>
+            <w:r>
+              <w:t xml:space="preserve">Checklist pass rate; condition mentions in reviews</w:t>
+            </w:r>
+          </w:p>
+        </w:tc>
+      </w:tr>
+      <w:tr>
+        <w:tc>
+          <w:tcPr/>
+          <w:p>
+            <w:pPr>
+              <w:pStyle w:val="Compact"/>
+              <w:jc w:val="left"/>
+            </w:pPr>
+            <w:r>
+              <w:t xml:space="preserve">R2</w:t>
+            </w:r>
+          </w:p>
+        </w:tc>
+        <w:tc>
+          <w:tcPr/>
+          <w:p>
+            <w:pPr>
+              <w:pStyle w:val="Compact"/>
+              <w:jc w:val="left"/>
+            </w:pPr>
+            <w:r>
+              <w:t xml:space="preserve">Breakfast recovery playbook</w:t>
+            </w:r>
+          </w:p>
+        </w:tc>
+        <w:tc>
+          <w:tcPr/>
+          <w:p>
+            <w:pPr>
+              <w:pStyle w:val="Compact"/>
+              <w:jc w:val="left"/>
+            </w:pPr>
+            <w:r>
+              <w:t xml:space="preserve">F&amp;B / guest services</w:t>
+            </w:r>
+          </w:p>
+        </w:tc>
+        <w:tc>
+          <w:tcPr/>
+          <w:p>
+            <w:pPr>
+              <w:pStyle w:val="Compact"/>
+              <w:jc w:val="left"/>
+            </w:pPr>
+            <w:r>
+              <w:t xml:space="preserve">~1 month</w:t>
+            </w:r>
+          </w:p>
+        </w:tc>
+        <w:tc>
+          <w:tcPr/>
+          <w:p>
+            <w:pPr>
+              <w:pStyle w:val="Compact"/>
+              <w:jc w:val="left"/>
+            </w:pPr>
+            <w:r>
+              <w:t xml:space="preserve">Low</w:t>
+            </w:r>
+          </w:p>
+        </w:tc>
+        <w:tc>
+          <w:tcPr/>
+          <w:p>
+            <w:pPr>
+              <w:pStyle w:val="Compact"/>
+              <w:jc w:val="left"/>
+            </w:pPr>
+            <w:r>
+              <w:t xml:space="preserve">Time to first response; make-good rate</w:t>
+            </w:r>
+          </w:p>
+        </w:tc>
+      </w:tr>
+      <w:tr>
+        <w:tc>
+          <w:tcPr/>
+          <w:p>
+            <w:pPr>
+              <w:pStyle w:val="Compact"/>
+              <w:jc w:val="left"/>
+            </w:pPr>
+            <w:r>
+              <w:t xml:space="preserve">R3</w:t>
+            </w:r>
+          </w:p>
+        </w:tc>
+        <w:tc>
+          <w:tcPr/>
+          <w:p>
+            <w:pPr>
+              <w:pStyle w:val="Compact"/>
+              <w:jc w:val="left"/>
+            </w:pPr>
+            <w:r>
+              <w:t xml:space="preserve">Spanish in-room kit (pilot floor)</w:t>
+            </w:r>
+          </w:p>
+        </w:tc>
+        <w:tc>
+          <w:tcPr/>
+          <w:p>
+            <w:pPr>
+              <w:pStyle w:val="Compact"/>
+              <w:jc w:val="left"/>
+            </w:pPr>
+            <w:r>
+              <w:t xml:space="preserve">Rooms division / F&amp;B</w:t>
+            </w:r>
+          </w:p>
+        </w:tc>
+        <w:tc>
+          <w:tcPr/>
+          <w:p>
+            <w:pPr>
+              <w:pStyle w:val="Compact"/>
+              <w:jc w:val="left"/>
+            </w:pPr>
+            <w:r>
+              <w:t xml:space="preserve">~3 months</w:t>
+            </w:r>
+          </w:p>
+        </w:tc>
+        <w:tc>
+          <w:tcPr/>
+          <w:p>
+            <w:pPr>
+              <w:pStyle w:val="Compact"/>
+              <w:jc w:val="left"/>
+            </w:pPr>
+            <w:r>
+              <w:t xml:space="preserve">Low to medium</w:t>
+            </w:r>
+          </w:p>
+        </w:tc>
+        <w:tc>
+          <w:tcPr/>
+          <w:p>
+            <w:pPr>
+              <w:pStyle w:val="Compact"/>
+              <w:jc w:val="left"/>
+            </w:pPr>
+            <w:r>
+              <w:t xml:space="preserve">In-room F&amp;B mentions; minibar spend</w:t>
+            </w:r>
+          </w:p>
+        </w:tc>
+      </w:tr>
+      <w:tr>
+        <w:tc>
+          <w:tcPr/>
+          <w:p>
+            <w:pPr>
+              <w:pStyle w:val="Compact"/>
+              <w:jc w:val="left"/>
+            </w:pPr>
+            <w:r>
+              <w:t xml:space="preserve">R4</w:t>
+            </w:r>
+          </w:p>
+        </w:tc>
+        <w:tc>
+          <w:tcPr/>
+          <w:p>
+            <w:pPr>
+              <w:pStyle w:val="Compact"/>
+              <w:jc w:val="left"/>
+            </w:pPr>
+            <w:r>
+              <w:t xml:space="preserve">Track The Level</w:t>
+            </w:r>
+          </w:p>
+        </w:tc>
+        <w:tc>
+          <w:tcPr/>
+          <w:p>
+            <w:pPr>
+              <w:pStyle w:val="Compact"/>
+              <w:jc w:val="left"/>
+            </w:pPr>
+            <w:r>
+              <w:t xml:space="preserve">Revenue / F&amp;B</w:t>
+            </w:r>
+          </w:p>
+        </w:tc>
+        <w:tc>
+          <w:tcPr/>
+          <w:p>
+            <w:pPr>
+              <w:pStyle w:val="Compact"/>
+              <w:jc w:val="left"/>
+            </w:pPr>
+            <w:r>
+              <w:t xml:space="preserve">~2 months</w:t>
+            </w:r>
+          </w:p>
+        </w:tc>
+        <w:tc>
+          <w:tcPr/>
+          <w:p>
+            <w:pPr>
+              <w:pStyle w:val="Compact"/>
+              <w:jc w:val="left"/>
+            </w:pPr>
+            <w:r>
+              <w:t xml:space="preserve">Low</w:t>
+            </w:r>
+          </w:p>
+        </w:tc>
+        <w:tc>
+          <w:tcPr/>
+          <w:p>
+            <w:pPr>
+              <w:pStyle w:val="Compact"/>
+              <w:jc w:val="left"/>
+            </w:pPr>
+            <w:r>
+              <w:t xml:space="preserve">Desk occupancy; redemption rate; spend per pass</w:t>
             </w:r>
           </w:p>
         </w:tc>

</xml_diff>

<commit_message>
Add author's first-hand observations to report
Co-Authored-By: Claude Sonnet 5.5 <noreply@anthropic.com>
Claude-Session: https://claude.ai/code/session_011X5bu1ABRj6tnHM3EMjxrh
</commit_message>
<xml_diff>
--- a/melia-report2/Melia-Promise-and-Proof-report.docx
+++ b/melia-report2/Melia-Promise-and-Proof-report.docx
@@ -238,7 +238,7 @@
         <w:pStyle w:val="BodyText"/>
       </w:pPr>
       <w:r>
-        <w:t xml:space="preserve">Primary data came from a hosted visit on 9 September 2025 [CONFIRM DATE AGAINST YOUR NOTES] (Veal, 2017). The visit had three parts. First, the group was seated and each person introduced themselves in turn, followed by a two-way question-and-answer session about hospitality careers, in which staff asked questions as well as answering them. Second, the group was split into small groups [CONFIRM: you recall groups of three, though some photographs show larger groups] and taken through the hotel’s rooms and facilities. Staff said rooms start from about £300 a night and stressed that the property is more than a hotel of rooms, with F&amp;B, lounge, wellness and workspace facilities. Third, drinks were served before the group left. Observation was non-participant and recorded in photographs, and the staff remarks are paraphrased from memory, not treated as policy.</w:t>
+        <w:t xml:space="preserve">Primary data came from a hosted visit on 9 September 2025 [CONFIRM DATE AGAINST YOUR NOTES] (Veal, 2017). The visit had three parts. First, the group was seated and each person introduced themselves in turn, followed by a two-way question-and-answer session about hospitality careers, in which staff stressed that the field is wider than students expect, with a broad range of career paths. Second, the group was split into small groups [CONFIRM: you recall groups of three, though some photographs show larger groups] and taken through the hotel’s rooms and facilities. Staff said rooms start from about £300 a night and stressed that the property is more than a hotel of rooms, with F&amp;B, lounge, wellness and workspace facilities. Third, drinks were served before the group left. Observation was non-participant and recorded in photographs, and the staff remarks are paraphrased from memory, not treated as policy.</w:t>
       </w:r>
     </w:p>
     <w:p>
@@ -505,6 +505,30 @@
       </w:pPr>
       <w:r>
         <w:t xml:space="preserve">The photographs show a clear split (evidence log in Appendix 1). In the public areas the design intent is consistent and the finish is high: the buffet (Fig. 2), the drinks station (Fig. 3), the lounge (Fig. 4), the ’35 Bar (Fig. 8) and a guest room with walnut headboard, bay window and a framed motorcycle artwork (Fig. 9) all read as premium. The faults sit in surfaces guests touch or look up at: the lift door (Fig. 1), the marble tray top and instant-coffee sachets (Fig. 5), the grille beside the cornice (Fig. 6) and a corridor where an open service door shows a laundry cart (Fig. 7). The corridor point is minor and may reflect tour timing.</w:t>
+      </w:r>
+    </w:p>
+    <w:p>
+      <w:pPr>
+        <w:pStyle w:val="BodyText"/>
+      </w:pPr>
+      <w:r>
+        <w:t xml:space="preserve">The author’s own first impression matches the photographs. What stood out first was how premium the hotel felt: the decoration, the marble, the design and the lighting, together with a gym, a bar, well-kept rooms, large beds and attached bathrooms. The one thing that looked wrong was the shelf holding the kettle and cups in the room. Its surface showed marks, possibly from a spilled drink, and it needed cleaning (Fig. 5). That is a small fault, but it sits beside surfaces that were otherwise cared for.</w:t>
+      </w:r>
+    </w:p>
+    <w:p>
+      <w:pPr>
+        <w:pStyle w:val="BodyText"/>
+      </w:pPr>
+      <w:r>
+        <w:t xml:space="preserve">The separate bar was the author’s favourite area. Drinks were displayed clearly, each type was served in its own glass (wine in a wine glass, beer in a beer glass, whiskey in a whiskey glass), and there was a set of premium whiskeys [CONFIRM WHICH BAR THIS WAS AND WHETHER THE DRINKS WERE SPANISH]. Gentile et al. (2007) argue that experience is built from many small components, and correct glassware is one of them. The bar met a standard that the room shelf did not, which is the inconsistency this report describes.</w:t>
+      </w:r>
+    </w:p>
+    <w:p>
+      <w:pPr>
+        <w:pStyle w:val="BodyText"/>
+      </w:pPr>
+      <w:r>
+        <w:t xml:space="preserve">Price changes how all this reads. The author, who comes from a middle-class family in Nepal, would not pay £300 a night for this hotel: the sum equals roughly NPR [X, CHECK THE RATE AND DATE], a large amount for a middle-class household, and a stay in this bracket is out of reach for many guests. This is a point about affordability, not about value. Zeithaml (1988) places value in the guest’s head, so the same room can be fair value to one guest and unaffordable to another, which helps explain why reviews of the same building differ.</w:t>
       </w:r>
     </w:p>
     <w:p>

</xml_diff>